<commit_message>
test: real matplotlib charts (bar, scatter, heatmap) in test document
- Figure 1: bar chart pre/post scores by group
- Figure 2: scatter plot usage vs exam score with regression line
- Figure 3: correlation heatmap of key variables
- Title at top, Sources section at bottom
- Add matplotlib to requirements.txt

https://claude.ai/code/session_019hH7nHgx1A58XRHvorgXUs
</commit_message>
<xml_diff>
--- a/test_apa_with_images.docx
+++ b/test_apa_with_images.docx
@@ -122,7 +122,7 @@
       <w:r>
         <w:drawing>
           <wp:inline xmlns:a="http://schemas.openxmlformats.org/drawingml/2006/main" xmlns:pic="http://schemas.openxmlformats.org/drawingml/2006/picture">
-            <wp:extent cx="4114800" cy="2263140"/>
+            <wp:extent cx="4572000" cy="2667000"/>
             <wp:docPr id="1" name="Picture 1"/>
             <wp:cNvGraphicFramePr>
               <a:graphicFrameLocks noChangeAspect="1"/>
@@ -143,7 +143,7 @@
                   <pic:spPr>
                     <a:xfrm>
                       <a:off x="0" y="0"/>
-                      <a:ext cx="4114800" cy="2263140"/>
+                      <a:ext cx="4572000" cy="2667000"/>
                     </a:xfrm>
                     <a:prstGeom prst="rect"/>
                   </pic:spPr>
@@ -189,7 +189,7 @@
       <w:r>
         <w:drawing>
           <wp:inline xmlns:a="http://schemas.openxmlformats.org/drawingml/2006/main" xmlns:pic="http://schemas.openxmlformats.org/drawingml/2006/picture">
-            <wp:extent cx="4114800" cy="2263140"/>
+            <wp:extent cx="4572000" cy="2667000"/>
             <wp:docPr id="2" name="Picture 2"/>
             <wp:cNvGraphicFramePr>
               <a:graphicFrameLocks noChangeAspect="1"/>
@@ -210,7 +210,7 @@
                   <pic:spPr>
                     <a:xfrm>
                       <a:off x="0" y="0"/>
-                      <a:ext cx="4114800" cy="2263140"/>
+                      <a:ext cx="4572000" cy="2667000"/>
                     </a:xfrm>
                     <a:prstGeom prst="rect"/>
                   </pic:spPr>
@@ -256,7 +256,7 @@
       <w:r>
         <w:drawing>
           <wp:inline xmlns:a="http://schemas.openxmlformats.org/drawingml/2006/main" xmlns:pic="http://schemas.openxmlformats.org/drawingml/2006/picture">
-            <wp:extent cx="4114800" cy="2263140"/>
+            <wp:extent cx="4572000" cy="3325091"/>
             <wp:docPr id="3" name="Picture 3"/>
             <wp:cNvGraphicFramePr>
               <a:graphicFrameLocks noChangeAspect="1"/>
@@ -277,7 +277,7 @@
                   <pic:spPr>
                     <a:xfrm>
                       <a:off x="0" y="0"/>
-                      <a:ext cx="4114800" cy="2263140"/>
+                      <a:ext cx="4572000" cy="3325091"/>
                     </a:xfrm>
                     <a:prstGeom prst="rect"/>
                   </pic:spPr>
@@ -294,7 +294,7 @@
         <w:jc w:val="center"/>
       </w:pPr>
       <w:r>
-        <w:t>Figure 3. Heatmap of feature correlations: usage metrics, prior GPA, and exam score.</w:t>
+        <w:t>Figure 3. Correlation matrix: usage metrics, prior GPA, feedback clicks, quiz attempts, and exam score.</w:t>
       </w:r>
     </w:p>
     <w:p>
@@ -333,7 +333,7 @@
         <w:pStyle w:val="Heading1"/>
       </w:pPr>
       <w:r>
-        <w:t>References</w:t>
+        <w:t>Sources</w:t>
       </w:r>
     </w:p>
     <w:p>

</xml_diff>